<commit_message>
Actualizar informe con la ejecución en Docker
- Tamaño y codificación reales de los CSV (5,1 GB, UTF-8) y lectura en
  bloques de 64 MB con detección automática de encoding.
- Tiempos, memoria y tabla comparativa de la ejecución registrada.
- Sección de reproducibilidad con Docker Compose y límites de memoria.
- Estructura del proyecto y numeración de secciones.

Co-Authored-By: Claude Opus 5 (1M context) <noreply@anthropic.com>
</commit_message>
<xml_diff>
--- a/entrega/Informe pipeline.docx
+++ b/entrega/Informe pipeline.docx
@@ -60,7 +60,7 @@
     </w:p>
     <w:p>
       <w:r>
-        <w:t>La fuente utilizada contiene archivos CSV de gran tamaño. Los dos archivos de visit_occurrence utilizados ocupan aproximadamente 10,32 GB en conjunto. Los archivos son sintéticos, por lo que el procesamiento no utiliza historias clínicas reales identificables.</w:t>
+        <w:t>La fuente utilizada contiene archivos CSV de gran tamaño. Los dos archivos de visit_occurrence utilizados ocupan aproximadamente 5,1 GB en conjunto (codificados en UTF-8, tal como los genera lzop al descomprimir los archivos originales). Los archivos son sintéticos, por lo que el procesamiento no utiliza historias clínicas reales identificables.</w:t>
       </w:r>
     </w:p>
     <w:p>
@@ -95,7 +95,7 @@
         <w:spacing w:after="40"/>
       </w:pPr>
       <w:r>
-        <w:t>Codificación de los CSV: UTF-16.</w:t>
+        <w:t>Codificación de los CSV: UTF-8. El pipeline detecta la codificación automáticamente y también admite copias en UTF-16.</w:t>
       </w:r>
     </w:p>
     <w:p>
@@ -691,7 +691,7 @@
     </w:p>
     <w:p>
       <w:r>
-        <w:t>Dask constituye la primera etapa del pipeline. Los dos archivos visit_occurrence se leen como DataFrames Dask independientes y posteriormente se concatenan. Debido a la codificación UTF-16 y a la diferencia de encabezados entre los archivos, se utiliza una lectura por archivo con blocksize=None. De esta forma se evita dividir incorrectamente el texto multibyte y se puede controlar explícitamente el encabezado del segundo archivo.</w:t>
+        <w:t>Dask constituye la primera etapa del pipeline. Los dos archivos visit_occurrence se leen como DataFrames Dask independientes y posteriormente se concatenan. La lectura se realiza en bloques de 64 MB (blocksize="64MB"), lo que genera 85 particiones y evita cargar cada archivo completo en memoria. La codificación se detecta automáticamente: si los CSV estuvieran en UTF-16, cada archivo se lee como una sola partición (blocksize=None), porque ese formato multibyte no puede dividirse en bloques de forma segura. La lectura por archivo permite además controlar explícitamente el encabezado del segundo archivo, que no lo contiene.</w:t>
       </w:r>
     </w:p>
     <w:p>
@@ -1072,7 +1072,7 @@
               <w:rPr>
                 <w:sz w:val="18"/>
               </w:rPr>
-              <w:t>10,32 GB CSV → 1,81 GB Parquet</w:t>
+              <w:t>5,1 GB CSV → 1,83 GB Parquet</w:t>
             </w:r>
           </w:p>
         </w:tc>
@@ -1086,7 +1086,7 @@
               <w:rPr>
                 <w:sz w:val="18"/>
               </w:rPr>
-              <w:t>2 particiones de entrada</w:t>
+              <w:t>85 particiones de entrada (bloques de 64 MB)</w:t>
             </w:r>
           </w:p>
         </w:tc>
@@ -1100,7 +1100,7 @@
               <w:rPr>
                 <w:sz w:val="18"/>
               </w:rPr>
-              <w:t>0,932</w:t>
+              <w:t>15,961</w:t>
             </w:r>
           </w:p>
         </w:tc>
@@ -1114,7 +1114,7 @@
               <w:rPr>
                 <w:sz w:val="18"/>
               </w:rPr>
-              <w:t>0,0</w:t>
+              <w:t>211,53</w:t>
             </w:r>
           </w:p>
         </w:tc>
@@ -1175,7 +1175,7 @@
               <w:rPr>
                 <w:sz w:val="18"/>
               </w:rPr>
-              <w:t>10,32 GB CSV → 1,81 GB Parquet</w:t>
+              <w:t>5,1 GB CSV → 1,83 GB Parquet</w:t>
             </w:r>
           </w:p>
         </w:tc>
@@ -1203,7 +1203,7 @@
               <w:rPr>
                 <w:sz w:val="18"/>
               </w:rPr>
-              <w:t>0,859</w:t>
+              <w:t>7,121</w:t>
             </w:r>
           </w:p>
         </w:tc>
@@ -1217,7 +1217,7 @@
               <w:rPr>
                 <w:sz w:val="18"/>
               </w:rPr>
-              <w:t>5,5</w:t>
+              <w:t>1,88</w:t>
             </w:r>
           </w:p>
         </w:tc>
@@ -1278,7 +1278,7 @@
               <w:rPr>
                 <w:sz w:val="18"/>
               </w:rPr>
-              <w:t>10,32 GB CSV → 1,81 GB Parquet</w:t>
+              <w:t>5,1 GB CSV → 1,83 GB Parquet</w:t>
             </w:r>
           </w:p>
         </w:tc>
@@ -1306,7 +1306,7 @@
               <w:rPr>
                 <w:sz w:val="18"/>
               </w:rPr>
-              <w:t>0,786</w:t>
+              <w:t>4,483</w:t>
             </w:r>
           </w:p>
         </w:tc>
@@ -1320,7 +1320,7 @@
               <w:rPr>
                 <w:sz w:val="18"/>
               </w:rPr>
-              <w:t>0,21</w:t>
+              <w:t>0,0</w:t>
             </w:r>
           </w:p>
         </w:tc>
@@ -1342,7 +1342,7 @@
     </w:tbl>
     <w:p>
       <w:r>
-        <w:t>Nota metodológica sobre memoria: los valores anteriores corresponden al delta de memoria RSS observado por psutil durante la operación, no a una medición del pico absoluto de memoria de todo el proceso. Por ello deben interpretarse como una referencia de consumo observado en la ejecución local.</w:t>
+        <w:t>Nota metodológica sobre memoria: los valores anteriores corresponden al delta de memoria RSS observado por psutil durante la operación, no a una medición del pico absoluto de memoria de todo el proceso. Por ello deben interpretarse como una referencia de consumo observado en la ejecución registrada.</w:t>
       </w:r>
     </w:p>
     <w:p>
@@ -1355,17 +1355,17 @@
     </w:p>
     <w:p>
       <w:r>
-        <w:t>La preparación de los datos con Dask tardó 141,957 segundos, incluyendo la lectura, transformación y escritura de Parquet. La comparación equivalente realizada con Dask sobre Parquet tardó 0,932 segundos.</w:t>
+        <w:t>La ejecución registrada se realizó con Docker Compose, en un contenedor con aproximadamente 4 GB de RAM. La preparación de los datos con Dask tardó 1218,663 segundos, incluyendo la lectura, transformación y escritura de Parquet. La comparación equivalente realizada con Dask sobre Parquet tardó 15,961 segundos.</w:t>
       </w:r>
     </w:p>
     <w:p>
       <w:r>
-        <w:t>En Spark, la ejecución completa del procesamiento —incluyendo lectura del Parquet, filtros, agregaciones, JOIN y función de ventana— tardó 24,939 segundos con shuffle.partitions=8 y 11,002 segundos con shuffle.partitions=16.</w:t>
+        <w:t>En Spark, la ejecución completa del procesamiento —incluyendo lectura del Parquet, filtros, agregaciones, JOIN y función de ventana— tardó 124,628 segundos con shuffle.partitions=8 y 101,542 segundos con shuffle.partitions=16.</w:t>
       </w:r>
     </w:p>
     <w:p>
       <w:r>
-        <w:t>Para la operación equivalente de conteo por año, Spark tardó 0,859 segundos con 8 particiones y 0,786 segundos con 16 particiones. Los conteos obtenidos por Dask y Spark fueron validados como iguales. En esta ejecución local, el aumento de 8 a 16 particiones redujo el tiempo observado, aunque este comportamiento no implica que 16 sea siempre la configuración óptima.</w:t>
+        <w:t>Para la operación equivalente de conteo por año, Spark tardó 7,121 segundos con 8 particiones y 4,483 segundos con 16 particiones. Los conteos obtenidos por Dask y Spark fueron validados como iguales (42.404.379 visitas válidas). En esta ejecución, el aumento de 8 a 16 particiones redujo el tiempo observado, aunque este comportamiento no implica que 16 sea siempre la configuración óptima.</w:t>
       </w:r>
     </w:p>
     <w:p>
@@ -1400,7 +1400,7 @@
         <w:spacing w:after="40"/>
       </w:pPr>
       <w:r>
-        <w:t>La operación equivalente muestra una diferencia pequeña entre Dask y Spark en este entorno local; por ello no se debe concluir que una herramienta sea universalmente más rápida.</w:t>
+        <w:t>En la operación equivalente Spark fue más rápido que Dask en este entorno (4,483 s con 16 particiones frente a 15,961 s); aun así, no se debe concluir que una herramienta sea universalmente más rápida.</w:t>
       </w:r>
     </w:p>
     <w:p>
@@ -1477,7 +1477,7 @@
     </w:p>
     <w:p>
       <w:r>
-        <w:t>El desarrollo local utiliza un entorno virtual .venv. La solución también contempla una ejecución reproducible mediante Dockerfile, donde se preparan Python, Java, Dask y PySpark. La estrategia evita copiar los datos masivos dentro de la imagen, manteniendo separados el entorno de ejecución y los archivos de datos.</w:t>
+        <w:t>El desarrollo local utiliza un entorno virtual .venv. La solución también contempla una ejecución reproducible mediante Dockerfile y docker-compose.yml, donde se preparan Python, Java, Dask y PySpark. La estrategia evita copiar los datos masivos dentro de la imagen: la carpeta data se monta como volumen, de modo que el contenedor lee los CSV y escribe los resultados directamente en las carpetas locales. Como Docker Desktop asigna aproximadamente 4 GB de RAM al contenedor, la memoria del driver de Spark se limita a 2 GB (SPARK_DRIVER_MEMORY) y la etapa Dask se ejecuta en un proceso aparte que libera su memoria antes de iniciar la JVM de Spark. El pipeline completo se reproduce con docker compose build y docker compose run --rm pipeline.</w:t>
       </w:r>
     </w:p>
     <w:p>
@@ -1491,7 +1491,7 @@
           <w:rFonts w:ascii="Consolas" w:hAnsi="Consolas"/>
           <w:sz w:val="18"/>
         </w:rPr>
-        <w:t>Trabajo BigData/</w:t>
+        <w:t>Trabajo-de-Big-Data/</w:t>
       </w:r>
       <w:r>
         <w:rPr>
@@ -1611,7 +1611,15 @@
           <w:sz w:val="18"/>
         </w:rPr>
         <w:br/>
-        <w:t>│   └── 04_pipeline_integrado.py</w:t>
+        <w:t>│   ├── 04_pipeline_integrado.py</w:t>
+      </w:r>
+      <w:r>
+        <w:rPr>
+          <w:rFonts w:ascii="Consolas" w:hAnsi="Consolas"/>
+          <w:sz w:val="18"/>
+        </w:rPr>
+        <w:br/>
+        <w:t>│   └── 05_prueba_docker.py</w:t>
       </w:r>
       <w:r>
         <w:rPr>
@@ -1635,6 +1643,22 @@
           <w:sz w:val="18"/>
         </w:rPr>
         <w:br/>
+        <w:t>├── Dockerfile</w:t>
+      </w:r>
+      <w:r>
+        <w:rPr>
+          <w:rFonts w:ascii="Consolas" w:hAnsi="Consolas"/>
+          <w:sz w:val="18"/>
+        </w:rPr>
+        <w:br/>
+        <w:t>├── docker-compose.yml</w:t>
+      </w:r>
+      <w:r>
+        <w:rPr>
+          <w:rFonts w:ascii="Consolas" w:hAnsi="Consolas"/>
+          <w:sz w:val="18"/>
+        </w:rPr>
+        <w:br/>
         <w:t>└── README.md</w:t>
       </w:r>
     </w:p>
@@ -1643,7 +1667,7 @@
         <w:pStyle w:val="Ttulo1"/>
       </w:pPr>
       <w:r>
-        <w:t>11. Conclusión técnica</w:t>
+        <w:t>10. Conclusión técnica</w:t>
       </w:r>
     </w:p>
     <w:p>
@@ -1658,7 +1682,7 @@
     </w:p>
     <w:p>
       <w:r>
-        <w:t>Los resultados de la ejecución local muestran que Spark obtuvo tiempos menores en la operación equivalente de conteo por año y que la configuración de 16 particiones produjo un tiempo menor que la de 8 particiones. Sin embargo, estos valores no deben interpretarse como una regla general: el rendimiento depende de los recursos disponibles, el tamaño y distribución de los datos y la configuración del motor.</w:t>
+        <w:t>Los resultados de la ejecución registrada muestran que Spark obtuvo tiempos menores en la operación equivalente de conteo por año y que la configuración de 16 particiones produjo un tiempo menor que la de 8 particiones. Sin embargo, estos valores no deben interpretarse como una regla general: el rendimiento depende de los recursos disponibles, el tamaño y distribución de los datos y la configuración del motor.</w:t>
       </w:r>
     </w:p>
     <w:p>
@@ -1675,7 +1699,7 @@
         <w:pStyle w:val="Ttulo1"/>
       </w:pPr>
       <w:r>
-        <w:t>12. Referencias</w:t>
+        <w:t>11. Referencias</w:t>
       </w:r>
     </w:p>
     <w:p>

</xml_diff>